<commit_message>
Slide cuối: poster game ô chữ "Ô chữ Tổ ấm" chơi trên giấy
- Poster vẽ bằng code: tên game xếp bằng ô chữ lật 3D, lưới ô chữ trang trí
  có cột từ khóa hàng dọc (ô trống, ghi "?", không lộ đáp án)
- Bỏ nút "Đang phát triển", "Sắp ra mắt", "Vào chơi" ở slide cuối
- Ngôi nhà 3D lùi ra góc để không che poster
- Cập nhật kịch bản (slide 28, 29) và README

Co-Authored-By: Claude Opus 5.5 <noreply@anthropic.com>
</commit_message>
<xml_diff>
--- a/docs/Kich-ban-thuyet-trinh-Nhom6.docx
+++ b/docs/Kich-ban-thuyet-trinh-Nhom6.docx
@@ -2456,7 +2456,7 @@
           <w:sz w:val="24"/>
           <w:szCs w:val="24"/>
         </w:rPr>
-        <w:t xml:space="preserve">Giáo trình tr. 257 - 258, 266 - 269 (liên hệ mục III.4). Khoảng 414 âm tiết, nói trong khoảng 2,5 phút.</w:t>
+        <w:t xml:space="preserve">Giáo trình tr. 257 - 258, 266 - 269 (liên hệ mục III.4). Khoảng 420 âm tiết, nói trong khoảng 2,5 phút.</w:t>
       </w:r>
     </w:p>
     <w:p>
@@ -2709,7 +2709,7 @@
           <w:sz w:val="26"/>
           <w:szCs w:val="26"/>
         </w:rPr>
-        <w:t xml:space="preserve">Phần trình bày của nhóm em đến đây là hết. Em cảm ơn thầy và các bạn đã lắng nghe. Mời cả lớp cùng chơi game tổng kết.</w:t>
+        <w:t xml:space="preserve">Phần trình bày của nhóm em đến đây là hết. Em cảm ơn thầy và các bạn đã lắng nghe. Mời cả lớp cùng chơi trò ô chữ tổng kết Ô chữ Tổ ấm.</w:t>
       </w:r>
     </w:p>
     <w:p>
@@ -2726,7 +2726,7 @@
           <w:sz w:val="26"/>
           <w:szCs w:val="26"/>
         </w:rPr>
-        <w:t xml:space="preserve">Slide 29. Game tổng kết</w:t>
+        <w:t xml:space="preserve">Slide 29. Game tổng kết: Ô chữ Tổ ấm</w:t>
       </w:r>
     </w:p>
     <w:p>
@@ -2742,7 +2742,7 @@
           <w:sz w:val="26"/>
           <w:szCs w:val="26"/>
         </w:rPr>
-        <w:t xml:space="preserve">(Quân, Phước, Duy phụ trách game điều khiển phần này.)</w:t>
+        <w:t xml:space="preserve">(Quân, Phước, Duy phụ trách trò ô chữ trên giấy. Slide chỉ hiện poster.)</w:t>
       </w:r>
     </w:p>
     <w:sectPr>

</xml_diff>